<commit_message>
Remove easter egg and bun recipe from Projekt 3 Word report
Delete the hidden test table row and section 6 from Raport_Projekt3.docx.

Co-authored-by: Michał Berlak <M1CH4L9@users.noreply.github.com>
</commit_message>
<xml_diff>
--- a/SWB-main/Projekt 3/Raport_Projekt3.docx
+++ b/SWB-main/Projekt 3/Raport_Projekt3.docx
@@ -503,38 +503,6 @@
           </w:p>
         </w:tc>
       </w:tr>
-      <w:tr>
-        <w:tc>
-          <w:tcPr>
-            <w:tcW w:type="dxa" w:w="2880"/>
-          </w:tcPr>
-          <w:p>
-            <w:r>
-              <w:t>Easter egg - podwojny tap</w:t>
-            </w:r>
-          </w:p>
-        </w:tc>
-        <w:tc>
-          <w:tcPr>
-            <w:tcW w:type="dxa" w:w="2880"/>
-          </w:tcPr>
-          <w:p>
-            <w:r>
-              <w:t>Napis na ekranie</w:t>
-            </w:r>
-          </w:p>
-        </w:tc>
-        <w:tc>
-          <w:tcPr>
-            <w:tcW w:type="dxa" w:w="2880"/>
-          </w:tcPr>
-          <w:p>
-            <w:r>
-              <w:t>Dziala na ekranie konfiguracji</w:t>
-            </w:r>
-          </w:p>
-        </w:tc>
-      </w:tr>
     </w:tbl>
     <w:p>
       <w:pPr>
@@ -582,19 +550,6 @@
       </w:pPr>
       <w:r>
         <w:t>Kalibracja dotyku moze wymagac dostrojenia stalych TOUCH_RAW_* w xpt2046.c.</w:t>
-      </w:r>
-    </w:p>
-    <w:p>
-      <w:pPr>
-        <w:pStyle w:val="Heading1"/>
-      </w:pPr>
-      <w:r>
-        <w:t>6. Przepis na bulki</w:t>
-      </w:r>
-    </w:p>
-    <w:p>
-      <w:r>
-        <w:t>Wez maka, drozdz, wode i sol. Zagniec, odstaw, upiecz. Jesli wyjda twarde jak kamien - to znaczy ze projekt embedded tez czasem tak wychodzi za pierwszym razem.</w:t>
       </w:r>
     </w:p>
     <w:sectPr>

</xml_diff>

<commit_message>
Update submission docs; main branch has fixed GUI_DrawScanFrame calls
Co-authored-by: Michał Berlak <M1CH4L9@users.noreply.github.com>
</commit_message>
<xml_diff>
--- a/SWB-main/Projekt 3/Raport_Projekt3.docx
+++ b/SWB-main/Projekt 3/Raport_Projekt3.docx
@@ -289,7 +289,7 @@
     </w:p>
     <w:p>
       <w:r>
-        <w:t>Dla kazdej pozycji serwa wykonywane sa 3 pomiary sonaru z timeoutem 50 ms. Pomiary poza zakresem 2-400 cm lub z timeoutem sa odrzucane. Z poprawnych prob liczona jest srednia arytmetyczna (filtracja). Po zakonczeniu skanu (lub w trakcie) wybierany jest najmniejszy dystans sposrod poprawnych pomiarow - odpowiadajacy indeksowi paska na ekranie. Pasek z najblizszym celem jest podswietlony zoltym obramowaniem. Pozycja serwa najblizszego celu jest mapowana na kroki silnika krokowego za pomoca interpolacji liniowej miedzy trzema punktami kalibracji (lewo, srodek, prawo).</w:t>
+        <w:t>Po zakonczeniu skanu wybierany jest najmniejszy dystans sposrod poprawnych pomiarow (najblizszy cel). W trakcie skanu na dole ekranu wyswietlany jest biezacy odczyt (Odczyt X cm), a zoltym obramowaniem podswietlany jest pasek z najblizszym celem wsrod juz zmierzonych pozycji. Po zakonczeniu calego skanu wyswietlana jest etykieta Cel X cm, a wskaznik krokowy ustawia sie w pozycji najblizszego obiektu.</w:t>
       </w:r>
     </w:p>
     <w:p>
@@ -549,7 +549,7 @@
         <w:pStyle w:val="ListBullet"/>
       </w:pPr>
       <w:r>
-        <w:t>Kalibracja dotyku moze wymagac dostrojenia stalych TOUCH_RAW_* w xpt2046.c.</w:t>
+        <w:t>Kalibracja dotyku dostepna jest z ekranu DIAG (przycisk KAL DOTYK, dwa rogi ekranu); dane zapisywane sa w pamieci Flash razem z konfiguracja.</w:t>
       </w:r>
     </w:p>
     <w:sectPr>

</xml_diff>